<commit_message>
feat: M1 completion sweep — testkit, audit trail, policy gate, graceful shutdown, headers ladder, replace skill
- Word: NextStoryRange ladder reaches multi-section headers/footers (fixture + contract test)

- office.host.shutdown: graceful sidecar teardown quits COM apps; no orphaned Office processes (inspect/render now close their documents)

- CommandResult.audit: policy/security/backend/application/duration trail on every command (proposal §27 criterion 10)

- second-layer §19 policy gate: host refuses relaxations of deny-by-default (macros/VBA/links/ExecuteMso) with mapped OFFICE_* codes

- office-testkit M1: JSON-RPC fixtures, FakeSidecar with Busy/modal/timeout/Protected-View fault injection

- skill office-global-text-replace (8-item contract; official dcc-mcp-cli lint green)

- pipe server: Win32Exception guard (malformed --pipe-name reports and exits)
</commit_message>
<xml_diff>
--- a/tests/fixtures/fixture-document.docx
+++ b/tests/fixtures/fixture-document.docx
@@ -33,6 +33,18 @@
         <w:rPr>
           <w:rFonts w:hint="eastAsia"/>
         </w:rPr>
+        <w:sectPr>
+          <w:headerReference w:type="even" r:id="rId6"/>
+          <w:headerReference w:type="default" r:id="rId7"/>
+          <w:footerReference w:type="even" r:id="rId8"/>
+          <w:footerReference w:type="default" r:id="rId9"/>
+          <w:headerReference w:type="first" r:id="rId10"/>
+          <w:footerReference w:type="first" r:id="rId11"/>
+          <w:pgSz w:w="11906" w:h="16838"/>
+          <w:pgMar w:top="1440" w:right="1800" w:bottom="1440" w:left="1800" w:header="851" w:footer="992" w:gutter="0"/>
+          <w:cols w:space="425"/>
+          <w:docGrid w:type="lines" w:linePitch="312"/>
+        </w:sectPr>
       </w:pPr>
       <w:r>
         <w:rPr>
@@ -41,7 +53,22 @@
         <w:t>DCC-MCP Office Automation Platform</w:t>
       </w:r>
     </w:p>
+    <w:p>
+      <w:pPr>
+        <w:rPr>
+          <w:rFonts w:hint="eastAsia"/>
+        </w:rPr>
+      </w:pPr>
+      <w:r>
+        <w:rPr>
+          <w:rFonts w:hint="eastAsia"/>
+        </w:rPr>
+        <w:t>Section two text with 2025年度 marker.</w:t>
+      </w:r>
+    </w:p>
     <w:sectPr>
+      <w:headerReference w:type="default" r:id="rId12"/>
+      <w:footerReference w:type="default" r:id="rId13"/>
       <w:pgSz w:w="11906" w:h="16838"/>
       <w:pgMar w:top="1440" w:right="1800" w:bottom="1440" w:left="1800" w:header="851" w:footer="992" w:gutter="0"/>
       <w:cols w:space="425"/>
@@ -49,6 +76,196 @@
     </w:sectPr>
   </w:body>
 </w:document>
+</file>
+
+<file path=word/endnotes.xml><?xml version="1.0" encoding="utf-8"?>
+<w:endnotes xmlns:wpc="http://schemas.microsoft.com/office/word/2010/wordprocessingCanvas" xmlns:cx="http://schemas.microsoft.com/office/drawing/2014/chartex" xmlns:cx1="http://schemas.microsoft.com/office/drawing/2015/9/8/chartex" xmlns:cx2="http://schemas.microsoft.com/office/drawing/2015/10/21/chartex" xmlns:cx3="http://schemas.microsoft.com/office/drawing/2016/5/9/chartex" xmlns:cx4="http://schemas.microsoft.com/office/drawing/2016/5/10/chartex" xmlns:cx5="http://schemas.microsoft.com/office/drawing/2016/5/11/chartex" xmlns:cx6="http://schemas.microsoft.com/office/drawing/2016/5/12/chartex" xmlns:cx7="http://schemas.microsoft.com/office/drawing/2016/5/13/chartex" xmlns:cx8="http://schemas.microsoft.com/office/drawing/2016/5/14/chartex" xmlns:mc="http://schemas.openxmlformats.org/markup-compatibility/2006" xmlns:aink="http://schemas.microsoft.com/office/drawing/2016/ink" xmlns:am3d="http://schemas.microsoft.com/office/drawing/2017/model3d" xmlns:o="urn:schemas-microsoft-com:office:office" xmlns:oel="http://schemas.microsoft.com/office/2019/extlst" xmlns:r="http://schemas.openxmlformats.org/officeDocument/2006/relationships" xmlns:m="http://schemas.openxmlformats.org/officeDocument/2006/math" xmlns:v="urn:schemas-microsoft-com:vml" xmlns:wp14="http://schemas.microsoft.com/office/word/2010/wordprocessingDrawing" xmlns:wp="http://schemas.openxmlformats.org/drawingml/2006/wordprocessingDrawing" xmlns:w10="urn:schemas-microsoft-com:office:word" xmlns:w="http://schemas.openxmlformats.org/wordprocessingml/2006/main" xmlns:w14="http://schemas.microsoft.com/office/word/2010/wordml" xmlns:w15="http://schemas.microsoft.com/office/word/2012/wordml" xmlns:w16cex="http://schemas.microsoft.com/office/word/2018/wordml/cex" xmlns:w16cid="http://schemas.microsoft.com/office/word/2016/wordml/cid" xmlns:w16="http://schemas.microsoft.com/office/word/2018/wordml" xmlns:w16du="http://schemas.microsoft.com/office/word/2023/wordml/word16du" xmlns:w16sdtdh="http://schemas.microsoft.com/office/word/2020/wordml/sdtdatahash" xmlns:w16sdtfl="http://schemas.microsoft.com/office/word/2024/wordml/sdtformatlock" xmlns:w16se="http://schemas.microsoft.com/office/word/2015/wordml/symex" xmlns:wpg="http://schemas.microsoft.com/office/word/2010/wordprocessingGroup" xmlns:wpi="http://schemas.microsoft.com/office/word/2010/wordprocessingInk" xmlns:wne="http://schemas.microsoft.com/office/word/2006/wordml" xmlns:wps="http://schemas.microsoft.com/office/word/2010/wordprocessingShape" mc:Ignorable="w14 w15 w16se w16cid w16 w16cex w16sdtdh w16sdtfl w16du wp14">
+  <w:endnote w:type="separator" w:id="-1">
+    <w:p>
+      <w:pPr>
+        <w:spacing w:after="0" w:line="240" w:lineRule="auto"/>
+        <w:rPr>
+          <w:rFonts w:hint="eastAsia"/>
+        </w:rPr>
+      </w:pPr>
+      <w:r>
+        <w:separator/>
+      </w:r>
+    </w:p>
+  </w:endnote>
+  <w:endnote w:type="continuationSeparator" w:id="0">
+    <w:p>
+      <w:pPr>
+        <w:spacing w:after="0" w:line="240" w:lineRule="auto"/>
+        <w:rPr>
+          <w:rFonts w:hint="eastAsia"/>
+        </w:rPr>
+      </w:pPr>
+      <w:r>
+        <w:continuationSeparator/>
+      </w:r>
+    </w:p>
+  </w:endnote>
+</w:endnotes>
+</file>
+
+<file path=word/footer1.xml><?xml version="1.0" encoding="utf-8"?>
+<w:ftr xmlns:wpc="http://schemas.microsoft.com/office/word/2010/wordprocessingCanvas" xmlns:cx="http://schemas.microsoft.com/office/drawing/2014/chartex" xmlns:cx1="http://schemas.microsoft.com/office/drawing/2015/9/8/chartex" xmlns:cx2="http://schemas.microsoft.com/office/drawing/2015/10/21/chartex" xmlns:cx3="http://schemas.microsoft.com/office/drawing/2016/5/9/chartex" xmlns:cx4="http://schemas.microsoft.com/office/drawing/2016/5/10/chartex" xmlns:cx5="http://schemas.microsoft.com/office/drawing/2016/5/11/chartex" xmlns:cx6="http://schemas.microsoft.com/office/drawing/2016/5/12/chartex" xmlns:cx7="http://schemas.microsoft.com/office/drawing/2016/5/13/chartex" xmlns:cx8="http://schemas.microsoft.com/office/drawing/2016/5/14/chartex" xmlns:mc="http://schemas.openxmlformats.org/markup-compatibility/2006" xmlns:aink="http://schemas.microsoft.com/office/drawing/2016/ink" xmlns:am3d="http://schemas.microsoft.com/office/drawing/2017/model3d" xmlns:o="urn:schemas-microsoft-com:office:office" xmlns:oel="http://schemas.microsoft.com/office/2019/extlst" xmlns:r="http://schemas.openxmlformats.org/officeDocument/2006/relationships" xmlns:m="http://schemas.openxmlformats.org/officeDocument/2006/math" xmlns:v="urn:schemas-microsoft-com:vml" xmlns:wp14="http://schemas.microsoft.com/office/word/2010/wordprocessingDrawing" xmlns:wp="http://schemas.openxmlformats.org/drawingml/2006/wordprocessingDrawing" xmlns:w10="urn:schemas-microsoft-com:office:word" xmlns:w="http://schemas.openxmlformats.org/wordprocessingml/2006/main" xmlns:w14="http://schemas.microsoft.com/office/word/2010/wordml" xmlns:w15="http://schemas.microsoft.com/office/word/2012/wordml" xmlns:w16cex="http://schemas.microsoft.com/office/word/2018/wordml/cex" xmlns:w16cid="http://schemas.microsoft.com/office/word/2016/wordml/cid" xmlns:w16="http://schemas.microsoft.com/office/word/2018/wordml" xmlns:w16du="http://schemas.microsoft.com/office/word/2023/wordml/word16du" xmlns:w16sdtdh="http://schemas.microsoft.com/office/word/2020/wordml/sdtdatahash" xmlns:w16sdtfl="http://schemas.microsoft.com/office/word/2024/wordml/sdtformatlock" xmlns:w16se="http://schemas.microsoft.com/office/word/2015/wordml/symex" xmlns:wpg="http://schemas.microsoft.com/office/word/2010/wordprocessingGroup" xmlns:wpi="http://schemas.microsoft.com/office/word/2010/wordprocessingInk" xmlns:wne="http://schemas.microsoft.com/office/word/2006/wordml" xmlns:wps="http://schemas.microsoft.com/office/word/2010/wordprocessingShape" mc:Ignorable="w14 w15 w16se w16cid w16 w16cex w16sdtdh w16sdtfl w16du wp14">
+  <w:p>
+    <w:pPr>
+      <w:pStyle w:val="af0"/>
+      <w:rPr>
+        <w:rFonts w:hint="eastAsia"/>
+      </w:rPr>
+    </w:pPr>
+  </w:p>
+</w:ftr>
+</file>
+
+<file path=word/footer2.xml><?xml version="1.0" encoding="utf-8"?>
+<w:ftr xmlns:wpc="http://schemas.microsoft.com/office/word/2010/wordprocessingCanvas" xmlns:cx="http://schemas.microsoft.com/office/drawing/2014/chartex" xmlns:cx1="http://schemas.microsoft.com/office/drawing/2015/9/8/chartex" xmlns:cx2="http://schemas.microsoft.com/office/drawing/2015/10/21/chartex" xmlns:cx3="http://schemas.microsoft.com/office/drawing/2016/5/9/chartex" xmlns:cx4="http://schemas.microsoft.com/office/drawing/2016/5/10/chartex" xmlns:cx5="http://schemas.microsoft.com/office/drawing/2016/5/11/chartex" xmlns:cx6="http://schemas.microsoft.com/office/drawing/2016/5/12/chartex" xmlns:cx7="http://schemas.microsoft.com/office/drawing/2016/5/13/chartex" xmlns:cx8="http://schemas.microsoft.com/office/drawing/2016/5/14/chartex" xmlns:mc="http://schemas.openxmlformats.org/markup-compatibility/2006" xmlns:aink="http://schemas.microsoft.com/office/drawing/2016/ink" xmlns:am3d="http://schemas.microsoft.com/office/drawing/2017/model3d" xmlns:o="urn:schemas-microsoft-com:office:office" xmlns:oel="http://schemas.microsoft.com/office/2019/extlst" xmlns:r="http://schemas.openxmlformats.org/officeDocument/2006/relationships" xmlns:m="http://schemas.openxmlformats.org/officeDocument/2006/math" xmlns:v="urn:schemas-microsoft-com:vml" xmlns:wp14="http://schemas.microsoft.com/office/word/2010/wordprocessingDrawing" xmlns:wp="http://schemas.openxmlformats.org/drawingml/2006/wordprocessingDrawing" xmlns:w10="urn:schemas-microsoft-com:office:word" xmlns:w="http://schemas.openxmlformats.org/wordprocessingml/2006/main" xmlns:w14="http://schemas.microsoft.com/office/word/2010/wordml" xmlns:w15="http://schemas.microsoft.com/office/word/2012/wordml" xmlns:w16cex="http://schemas.microsoft.com/office/word/2018/wordml/cex" xmlns:w16cid="http://schemas.microsoft.com/office/word/2016/wordml/cid" xmlns:w16="http://schemas.microsoft.com/office/word/2018/wordml" xmlns:w16du="http://schemas.microsoft.com/office/word/2023/wordml/word16du" xmlns:w16sdtdh="http://schemas.microsoft.com/office/word/2020/wordml/sdtdatahash" xmlns:w16sdtfl="http://schemas.microsoft.com/office/word/2024/wordml/sdtformatlock" xmlns:w16se="http://schemas.microsoft.com/office/word/2015/wordml/symex" xmlns:wpg="http://schemas.microsoft.com/office/word/2010/wordprocessingGroup" xmlns:wpi="http://schemas.microsoft.com/office/word/2010/wordprocessingInk" xmlns:wne="http://schemas.microsoft.com/office/word/2006/wordml" xmlns:wps="http://schemas.microsoft.com/office/word/2010/wordprocessingShape" mc:Ignorable="w14 w15 w16se w16cid w16 w16cex w16sdtdh w16sdtfl w16du wp14">
+  <w:p>
+    <w:pPr>
+      <w:pStyle w:val="af0"/>
+      <w:rPr>
+        <w:rFonts w:hint="eastAsia"/>
+      </w:rPr>
+    </w:pPr>
+    <w:r>
+      <w:rPr>
+        <w:rFonts w:hint="eastAsia"/>
+      </w:rPr>
+      <w:t>Footer One</w:t>
+    </w:r>
+  </w:p>
+</w:ftr>
+</file>
+
+<file path=word/footer3.xml><?xml version="1.0" encoding="utf-8"?>
+<w:ftr xmlns:wpc="http://schemas.microsoft.com/office/word/2010/wordprocessingCanvas" xmlns:cx="http://schemas.microsoft.com/office/drawing/2014/chartex" xmlns:cx1="http://schemas.microsoft.com/office/drawing/2015/9/8/chartex" xmlns:cx2="http://schemas.microsoft.com/office/drawing/2015/10/21/chartex" xmlns:cx3="http://schemas.microsoft.com/office/drawing/2016/5/9/chartex" xmlns:cx4="http://schemas.microsoft.com/office/drawing/2016/5/10/chartex" xmlns:cx5="http://schemas.microsoft.com/office/drawing/2016/5/11/chartex" xmlns:cx6="http://schemas.microsoft.com/office/drawing/2016/5/12/chartex" xmlns:cx7="http://schemas.microsoft.com/office/drawing/2016/5/13/chartex" xmlns:cx8="http://schemas.microsoft.com/office/drawing/2016/5/14/chartex" xmlns:mc="http://schemas.openxmlformats.org/markup-compatibility/2006" xmlns:aink="http://schemas.microsoft.com/office/drawing/2016/ink" xmlns:am3d="http://schemas.microsoft.com/office/drawing/2017/model3d" xmlns:o="urn:schemas-microsoft-com:office:office" xmlns:oel="http://schemas.microsoft.com/office/2019/extlst" xmlns:r="http://schemas.openxmlformats.org/officeDocument/2006/relationships" xmlns:m="http://schemas.openxmlformats.org/officeDocument/2006/math" xmlns:v="urn:schemas-microsoft-com:vml" xmlns:wp14="http://schemas.microsoft.com/office/word/2010/wordprocessingDrawing" xmlns:wp="http://schemas.openxmlformats.org/drawingml/2006/wordprocessingDrawing" xmlns:w10="urn:schemas-microsoft-com:office:word" xmlns:w="http://schemas.openxmlformats.org/wordprocessingml/2006/main" xmlns:w14="http://schemas.microsoft.com/office/word/2010/wordml" xmlns:w15="http://schemas.microsoft.com/office/word/2012/wordml" xmlns:w16cex="http://schemas.microsoft.com/office/word/2018/wordml/cex" xmlns:w16cid="http://schemas.microsoft.com/office/word/2016/wordml/cid" xmlns:w16="http://schemas.microsoft.com/office/word/2018/wordml" xmlns:w16du="http://schemas.microsoft.com/office/word/2023/wordml/word16du" xmlns:w16sdtdh="http://schemas.microsoft.com/office/word/2020/wordml/sdtdatahash" xmlns:w16sdtfl="http://schemas.microsoft.com/office/word/2024/wordml/sdtformatlock" xmlns:w16se="http://schemas.microsoft.com/office/word/2015/wordml/symex" xmlns:wpg="http://schemas.microsoft.com/office/word/2010/wordprocessingGroup" xmlns:wpi="http://schemas.microsoft.com/office/word/2010/wordprocessingInk" xmlns:wne="http://schemas.microsoft.com/office/word/2006/wordml" xmlns:wps="http://schemas.microsoft.com/office/word/2010/wordprocessingShape" mc:Ignorable="w14 w15 w16se w16cid w16 w16cex w16sdtdh w16sdtfl w16du wp14">
+  <w:p>
+    <w:pPr>
+      <w:pStyle w:val="af0"/>
+      <w:rPr>
+        <w:rFonts w:hint="eastAsia"/>
+      </w:rPr>
+    </w:pPr>
+  </w:p>
+</w:ftr>
+</file>
+
+<file path=word/footer4.xml><?xml version="1.0" encoding="utf-8"?>
+<w:ftr xmlns:wpc="http://schemas.microsoft.com/office/word/2010/wordprocessingCanvas" xmlns:cx="http://schemas.microsoft.com/office/drawing/2014/chartex" xmlns:cx1="http://schemas.microsoft.com/office/drawing/2015/9/8/chartex" xmlns:cx2="http://schemas.microsoft.com/office/drawing/2015/10/21/chartex" xmlns:cx3="http://schemas.microsoft.com/office/drawing/2016/5/9/chartex" xmlns:cx4="http://schemas.microsoft.com/office/drawing/2016/5/10/chartex" xmlns:cx5="http://schemas.microsoft.com/office/drawing/2016/5/11/chartex" xmlns:cx6="http://schemas.microsoft.com/office/drawing/2016/5/12/chartex" xmlns:cx7="http://schemas.microsoft.com/office/drawing/2016/5/13/chartex" xmlns:cx8="http://schemas.microsoft.com/office/drawing/2016/5/14/chartex" xmlns:mc="http://schemas.openxmlformats.org/markup-compatibility/2006" xmlns:aink="http://schemas.microsoft.com/office/drawing/2016/ink" xmlns:am3d="http://schemas.microsoft.com/office/drawing/2017/model3d" xmlns:o="urn:schemas-microsoft-com:office:office" xmlns:oel="http://schemas.microsoft.com/office/2019/extlst" xmlns:r="http://schemas.openxmlformats.org/officeDocument/2006/relationships" xmlns:m="http://schemas.openxmlformats.org/officeDocument/2006/math" xmlns:v="urn:schemas-microsoft-com:vml" xmlns:wp14="http://schemas.microsoft.com/office/word/2010/wordprocessingDrawing" xmlns:wp="http://schemas.openxmlformats.org/drawingml/2006/wordprocessingDrawing" xmlns:w10="urn:schemas-microsoft-com:office:word" xmlns:w="http://schemas.openxmlformats.org/wordprocessingml/2006/main" xmlns:w14="http://schemas.microsoft.com/office/word/2010/wordml" xmlns:w15="http://schemas.microsoft.com/office/word/2012/wordml" xmlns:w16cex="http://schemas.microsoft.com/office/word/2018/wordml/cex" xmlns:w16cid="http://schemas.microsoft.com/office/word/2016/wordml/cid" xmlns:w16="http://schemas.microsoft.com/office/word/2018/wordml" xmlns:w16du="http://schemas.microsoft.com/office/word/2023/wordml/word16du" xmlns:w16sdtdh="http://schemas.microsoft.com/office/word/2020/wordml/sdtdatahash" xmlns:w16sdtfl="http://schemas.microsoft.com/office/word/2024/wordml/sdtformatlock" xmlns:w16se="http://schemas.microsoft.com/office/word/2015/wordml/symex" xmlns:wpg="http://schemas.microsoft.com/office/word/2010/wordprocessingGroup" xmlns:wpi="http://schemas.microsoft.com/office/word/2010/wordprocessingInk" xmlns:wne="http://schemas.microsoft.com/office/word/2006/wordml" xmlns:wps="http://schemas.microsoft.com/office/word/2010/wordprocessingShape" mc:Ignorable="w14 w15 w16se w16cid w16 w16cex w16sdtdh w16sdtfl w16du wp14">
+  <w:p>
+    <w:pPr>
+      <w:pStyle w:val="af0"/>
+      <w:rPr>
+        <w:rFonts w:hint="eastAsia"/>
+      </w:rPr>
+    </w:pPr>
+    <w:r>
+      <w:rPr>
+        <w:rFonts w:hint="eastAsia"/>
+      </w:rPr>
+      <w:t>Footer Two: 2025年度</w:t>
+    </w:r>
+  </w:p>
+</w:ftr>
+</file>
+
+<file path=word/footnotes.xml><?xml version="1.0" encoding="utf-8"?>
+<w:footnotes xmlns:wpc="http://schemas.microsoft.com/office/word/2010/wordprocessingCanvas" xmlns:cx="http://schemas.microsoft.com/office/drawing/2014/chartex" xmlns:cx1="http://schemas.microsoft.com/office/drawing/2015/9/8/chartex" xmlns:cx2="http://schemas.microsoft.com/office/drawing/2015/10/21/chartex" xmlns:cx3="http://schemas.microsoft.com/office/drawing/2016/5/9/chartex" xmlns:cx4="http://schemas.microsoft.com/office/drawing/2016/5/10/chartex" xmlns:cx5="http://schemas.microsoft.com/office/drawing/2016/5/11/chartex" xmlns:cx6="http://schemas.microsoft.com/office/drawing/2016/5/12/chartex" xmlns:cx7="http://schemas.microsoft.com/office/drawing/2016/5/13/chartex" xmlns:cx8="http://schemas.microsoft.com/office/drawing/2016/5/14/chartex" xmlns:mc="http://schemas.openxmlformats.org/markup-compatibility/2006" xmlns:aink="http://schemas.microsoft.com/office/drawing/2016/ink" xmlns:am3d="http://schemas.microsoft.com/office/drawing/2017/model3d" xmlns:o="urn:schemas-microsoft-com:office:office" xmlns:oel="http://schemas.microsoft.com/office/2019/extlst" xmlns:r="http://schemas.openxmlformats.org/officeDocument/2006/relationships" xmlns:m="http://schemas.openxmlformats.org/officeDocument/2006/math" xmlns:v="urn:schemas-microsoft-com:vml" xmlns:wp14="http://schemas.microsoft.com/office/word/2010/wordprocessingDrawing" xmlns:wp="http://schemas.openxmlformats.org/drawingml/2006/wordprocessingDrawing" xmlns:w10="urn:schemas-microsoft-com:office:word" xmlns:w="http://schemas.openxmlformats.org/wordprocessingml/2006/main" xmlns:w14="http://schemas.microsoft.com/office/word/2010/wordml" xmlns:w15="http://schemas.microsoft.com/office/word/2012/wordml" xmlns:w16cex="http://schemas.microsoft.com/office/word/2018/wordml/cex" xmlns:w16cid="http://schemas.microsoft.com/office/word/2016/wordml/cid" xmlns:w16="http://schemas.microsoft.com/office/word/2018/wordml" xmlns:w16du="http://schemas.microsoft.com/office/word/2023/wordml/word16du" xmlns:w16sdtdh="http://schemas.microsoft.com/office/word/2020/wordml/sdtdatahash" xmlns:w16sdtfl="http://schemas.microsoft.com/office/word/2024/wordml/sdtformatlock" xmlns:w16se="http://schemas.microsoft.com/office/word/2015/wordml/symex" xmlns:wpg="http://schemas.microsoft.com/office/word/2010/wordprocessingGroup" xmlns:wpi="http://schemas.microsoft.com/office/word/2010/wordprocessingInk" xmlns:wne="http://schemas.microsoft.com/office/word/2006/wordml" xmlns:wps="http://schemas.microsoft.com/office/word/2010/wordprocessingShape" mc:Ignorable="w14 w15 w16se w16cid w16 w16cex w16sdtdh w16sdtfl w16du wp14">
+  <w:footnote w:type="separator" w:id="-1">
+    <w:p>
+      <w:pPr>
+        <w:spacing w:after="0" w:line="240" w:lineRule="auto"/>
+        <w:rPr>
+          <w:rFonts w:hint="eastAsia"/>
+        </w:rPr>
+      </w:pPr>
+      <w:r>
+        <w:separator/>
+      </w:r>
+    </w:p>
+  </w:footnote>
+  <w:footnote w:type="continuationSeparator" w:id="0">
+    <w:p>
+      <w:pPr>
+        <w:spacing w:after="0" w:line="240" w:lineRule="auto"/>
+        <w:rPr>
+          <w:rFonts w:hint="eastAsia"/>
+        </w:rPr>
+      </w:pPr>
+      <w:r>
+        <w:continuationSeparator/>
+      </w:r>
+    </w:p>
+  </w:footnote>
+</w:footnotes>
+</file>
+
+<file path=word/header1.xml><?xml version="1.0" encoding="utf-8"?>
+<w:hdr xmlns:wpc="http://schemas.microsoft.com/office/word/2010/wordprocessingCanvas" xmlns:cx="http://schemas.microsoft.com/office/drawing/2014/chartex" xmlns:cx1="http://schemas.microsoft.com/office/drawing/2015/9/8/chartex" xmlns:cx2="http://schemas.microsoft.com/office/drawing/2015/10/21/chartex" xmlns:cx3="http://schemas.microsoft.com/office/drawing/2016/5/9/chartex" xmlns:cx4="http://schemas.microsoft.com/office/drawing/2016/5/10/chartex" xmlns:cx5="http://schemas.microsoft.com/office/drawing/2016/5/11/chartex" xmlns:cx6="http://schemas.microsoft.com/office/drawing/2016/5/12/chartex" xmlns:cx7="http://schemas.microsoft.com/office/drawing/2016/5/13/chartex" xmlns:cx8="http://schemas.microsoft.com/office/drawing/2016/5/14/chartex" xmlns:mc="http://schemas.openxmlformats.org/markup-compatibility/2006" xmlns:aink="http://schemas.microsoft.com/office/drawing/2016/ink" xmlns:am3d="http://schemas.microsoft.com/office/drawing/2017/model3d" xmlns:o="urn:schemas-microsoft-com:office:office" xmlns:oel="http://schemas.microsoft.com/office/2019/extlst" xmlns:r="http://schemas.openxmlformats.org/officeDocument/2006/relationships" xmlns:m="http://schemas.openxmlformats.org/officeDocument/2006/math" xmlns:v="urn:schemas-microsoft-com:vml" xmlns:wp14="http://schemas.microsoft.com/office/word/2010/wordprocessingDrawing" xmlns:wp="http://schemas.openxmlformats.org/drawingml/2006/wordprocessingDrawing" xmlns:w10="urn:schemas-microsoft-com:office:word" xmlns:w="http://schemas.openxmlformats.org/wordprocessingml/2006/main" xmlns:w14="http://schemas.microsoft.com/office/word/2010/wordml" xmlns:w15="http://schemas.microsoft.com/office/word/2012/wordml" xmlns:w16cex="http://schemas.microsoft.com/office/word/2018/wordml/cex" xmlns:w16cid="http://schemas.microsoft.com/office/word/2016/wordml/cid" xmlns:w16="http://schemas.microsoft.com/office/word/2018/wordml" xmlns:w16du="http://schemas.microsoft.com/office/word/2023/wordml/word16du" xmlns:w16sdtdh="http://schemas.microsoft.com/office/word/2020/wordml/sdtdatahash" xmlns:w16sdtfl="http://schemas.microsoft.com/office/word/2024/wordml/sdtformatlock" xmlns:w16se="http://schemas.microsoft.com/office/word/2015/wordml/symex" xmlns:wpg="http://schemas.microsoft.com/office/word/2010/wordprocessingGroup" xmlns:wpi="http://schemas.microsoft.com/office/word/2010/wordprocessingInk" xmlns:wne="http://schemas.microsoft.com/office/word/2006/wordml" xmlns:wps="http://schemas.microsoft.com/office/word/2010/wordprocessingShape" mc:Ignorable="w14 w15 w16se w16cid w16 w16cex w16sdtdh w16sdtfl w16du wp14">
+  <w:p>
+    <w:pPr>
+      <w:pStyle w:val="ae"/>
+      <w:rPr>
+        <w:rFonts w:hint="eastAsia"/>
+      </w:rPr>
+    </w:pPr>
+  </w:p>
+</w:hdr>
+</file>
+
+<file path=word/header2.xml><?xml version="1.0" encoding="utf-8"?>
+<w:hdr xmlns:wpc="http://schemas.microsoft.com/office/word/2010/wordprocessingCanvas" xmlns:cx="http://schemas.microsoft.com/office/drawing/2014/chartex" xmlns:cx1="http://schemas.microsoft.com/office/drawing/2015/9/8/chartex" xmlns:cx2="http://schemas.microsoft.com/office/drawing/2015/10/21/chartex" xmlns:cx3="http://schemas.microsoft.com/office/drawing/2016/5/9/chartex" xmlns:cx4="http://schemas.microsoft.com/office/drawing/2016/5/10/chartex" xmlns:cx5="http://schemas.microsoft.com/office/drawing/2016/5/11/chartex" xmlns:cx6="http://schemas.microsoft.com/office/drawing/2016/5/12/chartex" xmlns:cx7="http://schemas.microsoft.com/office/drawing/2016/5/13/chartex" xmlns:cx8="http://schemas.microsoft.com/office/drawing/2016/5/14/chartex" xmlns:mc="http://schemas.openxmlformats.org/markup-compatibility/2006" xmlns:aink="http://schemas.microsoft.com/office/drawing/2016/ink" xmlns:am3d="http://schemas.microsoft.com/office/drawing/2017/model3d" xmlns:o="urn:schemas-microsoft-com:office:office" xmlns:oel="http://schemas.microsoft.com/office/2019/extlst" xmlns:r="http://schemas.openxmlformats.org/officeDocument/2006/relationships" xmlns:m="http://schemas.openxmlformats.org/officeDocument/2006/math" xmlns:v="urn:schemas-microsoft-com:vml" xmlns:wp14="http://schemas.microsoft.com/office/word/2010/wordprocessingDrawing" xmlns:wp="http://schemas.openxmlformats.org/drawingml/2006/wordprocessingDrawing" xmlns:w10="urn:schemas-microsoft-com:office:word" xmlns:w="http://schemas.openxmlformats.org/wordprocessingml/2006/main" xmlns:w14="http://schemas.microsoft.com/office/word/2010/wordml" xmlns:w15="http://schemas.microsoft.com/office/word/2012/wordml" xmlns:w16cex="http://schemas.microsoft.com/office/word/2018/wordml/cex" xmlns:w16cid="http://schemas.microsoft.com/office/word/2016/wordml/cid" xmlns:w16="http://schemas.microsoft.com/office/word/2018/wordml" xmlns:w16du="http://schemas.microsoft.com/office/word/2023/wordml/word16du" xmlns:w16sdtdh="http://schemas.microsoft.com/office/word/2020/wordml/sdtdatahash" xmlns:w16sdtfl="http://schemas.microsoft.com/office/word/2024/wordml/sdtformatlock" xmlns:w16se="http://schemas.microsoft.com/office/word/2015/wordml/symex" xmlns:wpg="http://schemas.microsoft.com/office/word/2010/wordprocessingGroup" xmlns:wpi="http://schemas.microsoft.com/office/word/2010/wordprocessingInk" xmlns:wne="http://schemas.microsoft.com/office/word/2006/wordml" xmlns:wps="http://schemas.microsoft.com/office/word/2010/wordprocessingShape" mc:Ignorable="w14 w15 w16se w16cid w16 w16cex w16sdtdh w16sdtfl w16du wp14">
+  <w:p>
+    <w:pPr>
+      <w:pStyle w:val="ae"/>
+      <w:rPr>
+        <w:rFonts w:hint="eastAsia"/>
+      </w:rPr>
+    </w:pPr>
+    <w:r>
+      <w:rPr>
+        <w:rFonts w:hint="eastAsia"/>
+      </w:rPr>
+      <w:t>Header One: 2025年度</w:t>
+    </w:r>
+  </w:p>
+</w:hdr>
+</file>
+
+<file path=word/header3.xml><?xml version="1.0" encoding="utf-8"?>
+<w:hdr xmlns:wpc="http://schemas.microsoft.com/office/word/2010/wordprocessingCanvas" xmlns:cx="http://schemas.microsoft.com/office/drawing/2014/chartex" xmlns:cx1="http://schemas.microsoft.com/office/drawing/2015/9/8/chartex" xmlns:cx2="http://schemas.microsoft.com/office/drawing/2015/10/21/chartex" xmlns:cx3="http://schemas.microsoft.com/office/drawing/2016/5/9/chartex" xmlns:cx4="http://schemas.microsoft.com/office/drawing/2016/5/10/chartex" xmlns:cx5="http://schemas.microsoft.com/office/drawing/2016/5/11/chartex" xmlns:cx6="http://schemas.microsoft.com/office/drawing/2016/5/12/chartex" xmlns:cx7="http://schemas.microsoft.com/office/drawing/2016/5/13/chartex" xmlns:cx8="http://schemas.microsoft.com/office/drawing/2016/5/14/chartex" xmlns:mc="http://schemas.openxmlformats.org/markup-compatibility/2006" xmlns:aink="http://schemas.microsoft.com/office/drawing/2016/ink" xmlns:am3d="http://schemas.microsoft.com/office/drawing/2017/model3d" xmlns:o="urn:schemas-microsoft-com:office:office" xmlns:oel="http://schemas.microsoft.com/office/2019/extlst" xmlns:r="http://schemas.openxmlformats.org/officeDocument/2006/relationships" xmlns:m="http://schemas.openxmlformats.org/officeDocument/2006/math" xmlns:v="urn:schemas-microsoft-com:vml" xmlns:wp14="http://schemas.microsoft.com/office/word/2010/wordprocessingDrawing" xmlns:wp="http://schemas.openxmlformats.org/drawingml/2006/wordprocessingDrawing" xmlns:w10="urn:schemas-microsoft-com:office:word" xmlns:w="http://schemas.openxmlformats.org/wordprocessingml/2006/main" xmlns:w14="http://schemas.microsoft.com/office/word/2010/wordml" xmlns:w15="http://schemas.microsoft.com/office/word/2012/wordml" xmlns:w16cex="http://schemas.microsoft.com/office/word/2018/wordml/cex" xmlns:w16cid="http://schemas.microsoft.com/office/word/2016/wordml/cid" xmlns:w16="http://schemas.microsoft.com/office/word/2018/wordml" xmlns:w16du="http://schemas.microsoft.com/office/word/2023/wordml/word16du" xmlns:w16sdtdh="http://schemas.microsoft.com/office/word/2020/wordml/sdtdatahash" xmlns:w16sdtfl="http://schemas.microsoft.com/office/word/2024/wordml/sdtformatlock" xmlns:w16se="http://schemas.microsoft.com/office/word/2015/wordml/symex" xmlns:wpg="http://schemas.microsoft.com/office/word/2010/wordprocessingGroup" xmlns:wpi="http://schemas.microsoft.com/office/word/2010/wordprocessingInk" xmlns:wne="http://schemas.microsoft.com/office/word/2006/wordml" xmlns:wps="http://schemas.microsoft.com/office/word/2010/wordprocessingShape" mc:Ignorable="w14 w15 w16se w16cid w16 w16cex w16sdtdh w16sdtfl w16du wp14">
+  <w:p>
+    <w:pPr>
+      <w:pStyle w:val="ae"/>
+      <w:rPr>
+        <w:rFonts w:hint="eastAsia"/>
+      </w:rPr>
+    </w:pPr>
+  </w:p>
+</w:hdr>
+</file>
+
+<file path=word/header4.xml><?xml version="1.0" encoding="utf-8"?>
+<w:hdr xmlns:wpc="http://schemas.microsoft.com/office/word/2010/wordprocessingCanvas" xmlns:cx="http://schemas.microsoft.com/office/drawing/2014/chartex" xmlns:cx1="http://schemas.microsoft.com/office/drawing/2015/9/8/chartex" xmlns:cx2="http://schemas.microsoft.com/office/drawing/2015/10/21/chartex" xmlns:cx3="http://schemas.microsoft.com/office/drawing/2016/5/9/chartex" xmlns:cx4="http://schemas.microsoft.com/office/drawing/2016/5/10/chartex" xmlns:cx5="http://schemas.microsoft.com/office/drawing/2016/5/11/chartex" xmlns:cx6="http://schemas.microsoft.com/office/drawing/2016/5/12/chartex" xmlns:cx7="http://schemas.microsoft.com/office/drawing/2016/5/13/chartex" xmlns:cx8="http://schemas.microsoft.com/office/drawing/2016/5/14/chartex" xmlns:mc="http://schemas.openxmlformats.org/markup-compatibility/2006" xmlns:aink="http://schemas.microsoft.com/office/drawing/2016/ink" xmlns:am3d="http://schemas.microsoft.com/office/drawing/2017/model3d" xmlns:o="urn:schemas-microsoft-com:office:office" xmlns:oel="http://schemas.microsoft.com/office/2019/extlst" xmlns:r="http://schemas.openxmlformats.org/officeDocument/2006/relationships" xmlns:m="http://schemas.openxmlformats.org/officeDocument/2006/math" xmlns:v="urn:schemas-microsoft-com:vml" xmlns:wp14="http://schemas.microsoft.com/office/word/2010/wordprocessingDrawing" xmlns:wp="http://schemas.openxmlformats.org/drawingml/2006/wordprocessingDrawing" xmlns:w10="urn:schemas-microsoft-com:office:word" xmlns:w="http://schemas.openxmlformats.org/wordprocessingml/2006/main" xmlns:w14="http://schemas.microsoft.com/office/word/2010/wordml" xmlns:w15="http://schemas.microsoft.com/office/word/2012/wordml" xmlns:w16cex="http://schemas.microsoft.com/office/word/2018/wordml/cex" xmlns:w16cid="http://schemas.microsoft.com/office/word/2016/wordml/cid" xmlns:w16="http://schemas.microsoft.com/office/word/2018/wordml" xmlns:w16du="http://schemas.microsoft.com/office/word/2023/wordml/word16du" xmlns:w16sdtdh="http://schemas.microsoft.com/office/word/2020/wordml/sdtdatahash" xmlns:w16sdtfl="http://schemas.microsoft.com/office/word/2024/wordml/sdtformatlock" xmlns:w16se="http://schemas.microsoft.com/office/word/2015/wordml/symex" xmlns:wpg="http://schemas.microsoft.com/office/word/2010/wordprocessingGroup" xmlns:wpi="http://schemas.microsoft.com/office/word/2010/wordprocessingInk" xmlns:wne="http://schemas.microsoft.com/office/word/2006/wordml" xmlns:wps="http://schemas.microsoft.com/office/word/2010/wordprocessingShape" mc:Ignorable="w14 w15 w16se w16cid w16 w16cex w16sdtdh w16sdtfl w16du wp14">
+  <w:p>
+    <w:pPr>
+      <w:pStyle w:val="ae"/>
+      <w:rPr>
+        <w:rFonts w:hint="eastAsia"/>
+      </w:rPr>
+    </w:pPr>
+    <w:r>
+      <w:rPr>
+        <w:rFonts w:hint="eastAsia"/>
+      </w:rPr>
+      <w:t>Header Two: 2025年度</w:t>
+    </w:r>
+  </w:p>
+</w:hdr>
 </file>
 
 <file path=word/styles.xml><?xml version="1.0" encoding="utf-8"?>
@@ -462,7 +679,7 @@
     <w:link w:val="10"/>
     <w:uiPriority w:val="9"/>
     <w:qFormat/>
-    <w:rsid w:val="009A2554"/>
+    <w:rsid w:val="00145C02"/>
     <w:pPr>
       <w:keepNext/>
       <w:keepLines/>
@@ -485,7 +702,7 @@
     <w:semiHidden/>
     <w:unhideWhenUsed/>
     <w:qFormat/>
-    <w:rsid w:val="009A2554"/>
+    <w:rsid w:val="00145C02"/>
     <w:pPr>
       <w:keepNext/>
       <w:keepLines/>
@@ -508,7 +725,7 @@
     <w:semiHidden/>
     <w:unhideWhenUsed/>
     <w:qFormat/>
-    <w:rsid w:val="009A2554"/>
+    <w:rsid w:val="00145C02"/>
     <w:pPr>
       <w:keepNext/>
       <w:keepLines/>
@@ -531,7 +748,7 @@
     <w:semiHidden/>
     <w:unhideWhenUsed/>
     <w:qFormat/>
-    <w:rsid w:val="009A2554"/>
+    <w:rsid w:val="00145C02"/>
     <w:pPr>
       <w:keepNext/>
       <w:keepLines/>
@@ -554,7 +771,7 @@
     <w:semiHidden/>
     <w:unhideWhenUsed/>
     <w:qFormat/>
-    <w:rsid w:val="009A2554"/>
+    <w:rsid w:val="00145C02"/>
     <w:pPr>
       <w:keepNext/>
       <w:keepLines/>
@@ -576,7 +793,7 @@
     <w:semiHidden/>
     <w:unhideWhenUsed/>
     <w:qFormat/>
-    <w:rsid w:val="009A2554"/>
+    <w:rsid w:val="00145C02"/>
     <w:pPr>
       <w:keepNext/>
       <w:keepLines/>
@@ -599,7 +816,7 @@
     <w:semiHidden/>
     <w:unhideWhenUsed/>
     <w:qFormat/>
-    <w:rsid w:val="009A2554"/>
+    <w:rsid w:val="00145C02"/>
     <w:pPr>
       <w:keepNext/>
       <w:keepLines/>
@@ -622,7 +839,7 @@
     <w:semiHidden/>
     <w:unhideWhenUsed/>
     <w:qFormat/>
-    <w:rsid w:val="009A2554"/>
+    <w:rsid w:val="00145C02"/>
     <w:pPr>
       <w:keepNext/>
       <w:keepLines/>
@@ -643,7 +860,7 @@
     <w:semiHidden/>
     <w:unhideWhenUsed/>
     <w:qFormat/>
-    <w:rsid w:val="009A2554"/>
+    <w:rsid w:val="00145C02"/>
     <w:pPr>
       <w:keepNext/>
       <w:keepLines/>
@@ -687,7 +904,7 @@
     <w:basedOn w:val="a0"/>
     <w:link w:val="1"/>
     <w:uiPriority w:val="9"/>
-    <w:rsid w:val="009A2554"/>
+    <w:rsid w:val="00145C02"/>
     <w:rPr>
       <w:rFonts w:asciiTheme="majorHAnsi" w:eastAsiaTheme="majorEastAsia" w:hAnsiTheme="majorHAnsi" w:cstheme="majorBidi"/>
       <w:color w:val="0F4761" w:themeColor="accent1" w:themeShade="BF"/>
@@ -701,7 +918,7 @@
     <w:link w:val="2"/>
     <w:uiPriority w:val="9"/>
     <w:semiHidden/>
-    <w:rsid w:val="009A2554"/>
+    <w:rsid w:val="00145C02"/>
     <w:rPr>
       <w:rFonts w:asciiTheme="majorHAnsi" w:eastAsiaTheme="majorEastAsia" w:hAnsiTheme="majorHAnsi" w:cstheme="majorBidi"/>
       <w:color w:val="0F4761" w:themeColor="accent1" w:themeShade="BF"/>
@@ -715,7 +932,7 @@
     <w:link w:val="3"/>
     <w:uiPriority w:val="9"/>
     <w:semiHidden/>
-    <w:rsid w:val="009A2554"/>
+    <w:rsid w:val="00145C02"/>
     <w:rPr>
       <w:rFonts w:asciiTheme="majorHAnsi" w:eastAsiaTheme="majorEastAsia" w:hAnsiTheme="majorHAnsi" w:cstheme="majorBidi"/>
       <w:color w:val="0F4761" w:themeColor="accent1" w:themeShade="BF"/>
@@ -729,7 +946,7 @@
     <w:link w:val="4"/>
     <w:uiPriority w:val="9"/>
     <w:semiHidden/>
-    <w:rsid w:val="009A2554"/>
+    <w:rsid w:val="00145C02"/>
     <w:rPr>
       <w:rFonts w:cstheme="majorBidi"/>
       <w:color w:val="0F4761" w:themeColor="accent1" w:themeShade="BF"/>
@@ -743,7 +960,7 @@
     <w:link w:val="5"/>
     <w:uiPriority w:val="9"/>
     <w:semiHidden/>
-    <w:rsid w:val="009A2554"/>
+    <w:rsid w:val="00145C02"/>
     <w:rPr>
       <w:rFonts w:cstheme="majorBidi"/>
       <w:color w:val="0F4761" w:themeColor="accent1" w:themeShade="BF"/>
@@ -756,7 +973,7 @@
     <w:link w:val="6"/>
     <w:uiPriority w:val="9"/>
     <w:semiHidden/>
-    <w:rsid w:val="009A2554"/>
+    <w:rsid w:val="00145C02"/>
     <w:rPr>
       <w:rFonts w:cstheme="majorBidi"/>
       <w:b/>
@@ -770,7 +987,7 @@
     <w:link w:val="7"/>
     <w:uiPriority w:val="9"/>
     <w:semiHidden/>
-    <w:rsid w:val="009A2554"/>
+    <w:rsid w:val="00145C02"/>
     <w:rPr>
       <w:rFonts w:cstheme="majorBidi"/>
       <w:b/>
@@ -784,7 +1001,7 @@
     <w:link w:val="8"/>
     <w:uiPriority w:val="9"/>
     <w:semiHidden/>
-    <w:rsid w:val="009A2554"/>
+    <w:rsid w:val="00145C02"/>
     <w:rPr>
       <w:rFonts w:cstheme="majorBidi"/>
       <w:color w:val="595959" w:themeColor="text1" w:themeTint="A6"/>
@@ -796,7 +1013,7 @@
     <w:link w:val="9"/>
     <w:uiPriority w:val="9"/>
     <w:semiHidden/>
-    <w:rsid w:val="009A2554"/>
+    <w:rsid w:val="00145C02"/>
     <w:rPr>
       <w:rFonts w:eastAsiaTheme="majorEastAsia" w:cstheme="majorBidi"/>
       <w:color w:val="595959" w:themeColor="text1" w:themeTint="A6"/>
@@ -809,7 +1026,7 @@
     <w:link w:val="a4"/>
     <w:uiPriority w:val="10"/>
     <w:qFormat/>
-    <w:rsid w:val="009A2554"/>
+    <w:rsid w:val="00145C02"/>
     <w:pPr>
       <w:spacing w:after="80" w:line="240" w:lineRule="auto"/>
       <w:contextualSpacing/>
@@ -828,7 +1045,7 @@
     <w:basedOn w:val="a0"/>
     <w:link w:val="a3"/>
     <w:uiPriority w:val="10"/>
-    <w:rsid w:val="009A2554"/>
+    <w:rsid w:val="00145C02"/>
     <w:rPr>
       <w:rFonts w:asciiTheme="majorHAnsi" w:eastAsiaTheme="majorEastAsia" w:hAnsiTheme="majorHAnsi" w:cstheme="majorBidi"/>
       <w:spacing w:val="-10"/>
@@ -844,7 +1061,7 @@
     <w:link w:val="a6"/>
     <w:uiPriority w:val="11"/>
     <w:qFormat/>
-    <w:rsid w:val="009A2554"/>
+    <w:rsid w:val="00145C02"/>
     <w:pPr>
       <w:numPr>
         <w:ilvl w:val="1"/>
@@ -864,7 +1081,7 @@
     <w:basedOn w:val="a0"/>
     <w:link w:val="a5"/>
     <w:uiPriority w:val="11"/>
-    <w:rsid w:val="009A2554"/>
+    <w:rsid w:val="00145C02"/>
     <w:rPr>
       <w:rFonts w:asciiTheme="majorHAnsi" w:eastAsiaTheme="majorEastAsia" w:hAnsiTheme="majorHAnsi" w:cstheme="majorBidi"/>
       <w:color w:val="595959" w:themeColor="text1" w:themeTint="A6"/>
@@ -880,7 +1097,7 @@
     <w:link w:val="a8"/>
     <w:uiPriority w:val="29"/>
     <w:qFormat/>
-    <w:rsid w:val="009A2554"/>
+    <w:rsid w:val="00145C02"/>
     <w:pPr>
       <w:spacing w:before="160"/>
       <w:jc w:val="center"/>
@@ -896,7 +1113,7 @@
     <w:basedOn w:val="a0"/>
     <w:link w:val="a7"/>
     <w:uiPriority w:val="29"/>
-    <w:rsid w:val="009A2554"/>
+    <w:rsid w:val="00145C02"/>
     <w:rPr>
       <w:i/>
       <w:iCs/>
@@ -908,7 +1125,7 @@
     <w:basedOn w:val="a"/>
     <w:uiPriority w:val="34"/>
     <w:qFormat/>
-    <w:rsid w:val="009A2554"/>
+    <w:rsid w:val="00145C02"/>
     <w:pPr>
       <w:ind w:left="720"/>
       <w:contextualSpacing/>
@@ -919,7 +1136,7 @@
     <w:basedOn w:val="a0"/>
     <w:uiPriority w:val="21"/>
     <w:qFormat/>
-    <w:rsid w:val="009A2554"/>
+    <w:rsid w:val="00145C02"/>
     <w:rPr>
       <w:i/>
       <w:iCs/>
@@ -933,7 +1150,7 @@
     <w:link w:val="ac"/>
     <w:uiPriority w:val="30"/>
     <w:qFormat/>
-    <w:rsid w:val="009A2554"/>
+    <w:rsid w:val="00145C02"/>
     <w:pPr>
       <w:pBdr>
         <w:top w:val="single" w:sz="4" w:space="10" w:color="0F4761" w:themeColor="accent1" w:themeShade="BF"/>
@@ -954,7 +1171,7 @@
     <w:basedOn w:val="a0"/>
     <w:link w:val="ab"/>
     <w:uiPriority w:val="30"/>
-    <w:rsid w:val="009A2554"/>
+    <w:rsid w:val="00145C02"/>
     <w:rPr>
       <w:i/>
       <w:iCs/>
@@ -966,13 +1183,76 @@
     <w:basedOn w:val="a0"/>
     <w:uiPriority w:val="32"/>
     <w:qFormat/>
-    <w:rsid w:val="009A2554"/>
+    <w:rsid w:val="00145C02"/>
     <w:rPr>
       <w:b/>
       <w:bCs/>
       <w:smallCaps/>
       <w:color w:val="0F4761" w:themeColor="accent1" w:themeShade="BF"/>
       <w:spacing w:val="5"/>
+    </w:rPr>
+  </w:style>
+  <w:style w:type="paragraph" w:styleId="ae">
+    <w:name w:val="header"/>
+    <w:basedOn w:val="a"/>
+    <w:link w:val="af"/>
+    <w:uiPriority w:val="99"/>
+    <w:unhideWhenUsed/>
+    <w:rsid w:val="00145C02"/>
+    <w:pPr>
+      <w:tabs>
+        <w:tab w:val="center" w:pos="4153"/>
+        <w:tab w:val="right" w:pos="8306"/>
+      </w:tabs>
+      <w:snapToGrid w:val="0"/>
+      <w:spacing w:line="240" w:lineRule="auto"/>
+      <w:jc w:val="center"/>
+    </w:pPr>
+    <w:rPr>
+      <w:sz w:val="18"/>
+      <w:szCs w:val="18"/>
+    </w:rPr>
+  </w:style>
+  <w:style w:type="character" w:customStyle="1" w:styleId="af">
+    <w:name w:val="页眉 字符"/>
+    <w:basedOn w:val="a0"/>
+    <w:link w:val="ae"/>
+    <w:uiPriority w:val="99"/>
+    <w:rsid w:val="00145C02"/>
+    <w:rPr>
+      <w:sz w:val="18"/>
+      <w:szCs w:val="18"/>
+    </w:rPr>
+  </w:style>
+  <w:style w:type="paragraph" w:styleId="af0">
+    <w:name w:val="footer"/>
+    <w:basedOn w:val="a"/>
+    <w:link w:val="af1"/>
+    <w:uiPriority w:val="99"/>
+    <w:unhideWhenUsed/>
+    <w:rsid w:val="00145C02"/>
+    <w:pPr>
+      <w:tabs>
+        <w:tab w:val="center" w:pos="4153"/>
+        <w:tab w:val="right" w:pos="8306"/>
+      </w:tabs>
+      <w:snapToGrid w:val="0"/>
+      <w:spacing w:line="240" w:lineRule="auto"/>
+    </w:pPr>
+    <w:rPr>
+      <w:sz w:val="18"/>
+      <w:szCs w:val="18"/>
+    </w:rPr>
+  </w:style>
+  <w:style w:type="character" w:customStyle="1" w:styleId="af1">
+    <w:name w:val="页脚 字符"/>
+    <w:basedOn w:val="a0"/>
+    <w:link w:val="af0"/>
+    <w:uiPriority w:val="99"/>
+    <w:rsid w:val="00145C02"/>
+    <w:rPr>
+      <w:sz w:val="18"/>
+      <w:szCs w:val="18"/>
     </w:rPr>
   </w:style>
 </w:styles>

</xml_diff>